<commit_message>
feat: update auction platform, wallet and friends messaging
Refresh auction screens, scheduling, rankings, fees, media, audio and notifications. Add wallet withdrawal and vault flows, automatic product codes, persistent friends and private messages with display names and four-digit codes. Update documentation, assets and regression tests.
</commit_message>
<xml_diff>
--- a/docs/LUAT_DAU_GIA_BTL16.docx
+++ b/docs/LUAT_DAU_GIA_BTL16.docx
@@ -17,7 +17,7 @@
       </w:pPr>
       <w:r>
         <w:rPr/>
-        <w:t xml:space="preserve">Bản ngày 19/10/2026</w:t>
+        <w:t xml:space="preserve">Bản ngày 29/10/2026</w:t>
       </w:r>
     </w:p>
     <w:p>
@@ -122,11 +122,76 @@
         <w:rPr>
           <w:b/>
         </w:rPr>
-        <w:t xml:space="preserve">Đã nhập</w:t>
-      </w:r>
-      <w:r>
-        <w:rPr/>
-        <w:t xml:space="preserve"> để gửi yêu cầu nạp; tiền chỉ được cộng khi người vận hành chấp nhận. Mã QR không thực hiện chuyển khoản thật. Mỗi tài khoản chỉ có một yêu cầu đang chờ; yêu cầu bị từ chối không làm tăng số dư, yêu cầu đã duyệt không được cộng lại.</w:t>
+        <w:t xml:space="preserve">Đã nạp</w:t>
+      </w:r>
+      <w:r>
+        <w:rPr/>
+        <w:t xml:space="preserve"> để gửi yêu cầu nạp; tiền chỉ được cộng khi người vận hành chấp nhận. Mã QR không thực hiện chuyển khoản thật. Mỗi tài khoản chỉ có một yêu cầu nạp đang chờ; yêu cầu bị từ chối không làm tăng số dư, yêu cầu đã duyệt không được cộng lại.</w:t>
+      </w:r>
+    </w:p>
+    <w:p>
+      <w:pPr>
+        <w:pStyle w:val="Normal"/>
+      </w:pPr>
+      <w:r>
+        <w:rPr/>
+        <w:t xml:space="preserve">• Trong Ví &amp; nạp/rút tiền, người dùng chọn Rút tiền và gửi số tiền từ 1.000 đến 1.000.000.000 đồng, tối đa hai chữ số thập phân và không vượt số dư khả dụng. Mỗi tài khoản chỉ có một yêu cầu rút đang chờ; gửi yêu cầu chưa trừ tiền hoặc giữ chỗ. Người vận hành duyệt tại mục Duyệt rút tiền trên Server; tại thời điểm duyệt phải còn đủ khả dụng, sau đó ví được trừ đúng số tiền đã yêu cầu và ghi sổ giao dịch trong cùng giao dịch cơ sở dữ liệu. Không được rút khoản tiền đang giữ chỗ đấu giá. Duyệt lại không trừ trùng; từ chối giữ nguyên số dư và lưu lý do. Đây là rút tiền mô phỏng, không chuyển tiền ra tài khoản ngân hàng.</w:t>
+      </w:r>
+    </w:p>
+    <w:p>
+      <w:pPr>
+        <w:pStyle w:val="Normal"/>
+      </w:pPr>
+      <w:r>
+        <w:rPr/>
+        <w:t xml:space="preserve">• Mục </w:t>
+      </w:r>
+      <w:r>
+        <w:rPr>
+          <w:b/>
+        </w:rPr>
+        <w:t xml:space="preserve">Giao dịch</w:t>
+      </w:r>
+      <w:r>
+        <w:rPr/>
+        <w:t xml:space="preserve"> riêng hiển thị lịch sử cộng/trừ tiền của tài khoản: nạp/rút đã duyệt, mua/bán và chuyển tiền giữa ví với két sắt. Có thể lọc theo loại, mã phiên và khoảng ngày; yêu cầu nạp/rút chưa duyệt vẫn xem trong Ví &amp; nạp/rút tiền. Các dòng giữ/hoàn tiền giữ chỗ và phiên cũ cần kiểm tra thanh toán được lưu trên Server để đối soát, không hiển thị trong danh sách và bộ lọc giao dịch cá nhân.</w:t>
+      </w:r>
+    </w:p>
+    <w:p>
+      <w:pPr>
+        <w:pStyle w:val="Normal"/>
+      </w:pPr>
+      <w:r>
+        <w:rPr/>
+        <w:t xml:space="preserve">• Trong tab </w:t>
+      </w:r>
+      <w:r>
+        <w:rPr>
+          <w:b/>
+        </w:rPr>
+        <w:t xml:space="preserve">Két sắt</w:t>
+      </w:r>
+      <w:r>
+        <w:rPr/>
+        <w:t xml:space="preserve">, lần chuyển đầu tiên từ số dư khả dụng đồng thời tạo mã PIN đúng 6 chữ số và xác nhận lại PIN. Những lần mở két sau cần nhập PIN một lần để chuyển vào két; mỗi lần rút từ két về ví phải xác nhận PIN thêm một lần. Rời tab hoặc trang sẽ khóa két; phiên mở cũng hết hạn sau 15 phút không sử dụng. Nhập sai PIN 5 lần sẽ tạm khóa xác thực PIN trong 60 giây. PIN được lưu dưới dạng băm, không hiển thị cho người vận hành.</w:t>
+      </w:r>
+    </w:p>
+    <w:p>
+      <w:pPr>
+        <w:pStyle w:val="Normal"/>
+      </w:pPr>
+      <w:r>
+        <w:rPr/>
+        <w:t xml:space="preserve">• Tiền trong két không nằm trong số dư khả dụng để đấu giá hoặc rút tiền khỏi ví; muốn sử dụng phải rút từ két về ví trước. Chuyển ví/két có hiệu lực ngay, không cần duyệt và không mất phí; cập nhật hai số dư cùng lịch sử trong một giao dịch cơ sở dữ liệu. Gửi lại cùng mã giao dịch và cùng nội dung không chuyển tiền hai lần. Tiền đang giữ chỗ không được chuyển vào két.</w:t>
+      </w:r>
+    </w:p>
+    <w:p>
+      <w:pPr>
+        <w:pStyle w:val="Normal"/>
+      </w:pPr>
+      <w:r>
+        <w:rPr/>
+        <w:t xml:space="preserve">• Mục Phiên nổi bật xếp tối đa năm phiên công khai đang diễn ra theo tổng số người hiện có trong phòng, lượt vào phòng và lượt ra giá hợp lệ; mỗi người hoặc lượt được tính một điểm. Rời phòng không cộng điểm lượt vào và giảm số người hiện có; phòng trống không có điểm từ số người. Một tài khoản mở nhiều kết nối đồng thời trong cùng phòng vẫn chỉ được tính là một người và một lượt vào.</w:t>
       </w:r>
     </w:p>
     <w:p>
@@ -351,7 +416,36 @@
       </w:pPr>
       <w:r>
         <w:rPr/>
-        <w:t xml:space="preserve">• Khi mở phiên, người bán phải công bố giá khởi điểm, bước giá, thời lượng và loại phiên công khai hoặc riêng. Phiên bắt đầu ngay khi được mở; chưa có hình thức đặt lịch bắt đầu trong tương lai.</w:t>
+        <w:t xml:space="preserve">• Khi tạo phiên, người bán phải công bố giá khởi điểm, bước giá, thời lượng và loại phiên công khai hoặc riêng. Có thể chọn bắt đầu ngay hoặc hẹn ngày, giờ bắt đầu trong tương lai. Ngày giờ nhập theo múi giờ trên máy người bán; máy chủ lưu thời điểm tuyệt đối để các máy cùng tuân theo một lịch. Lịch không tự thay đổi khi khởi động lại máy chủ.</w:t>
+      </w:r>
+    </w:p>
+    <w:p>
+      <w:pPr>
+        <w:pStyle w:val="Normal"/>
+      </w:pPr>
+      <w:r>
+        <w:rPr/>
+        <w:t xml:space="preserve">• Phiên hẹn giờ nằm trong mục </w:t>
+      </w:r>
+      <w:r>
+        <w:rPr>
+          <w:b/>
+        </w:rPr>
+        <w:t xml:space="preserve">Sắp diễn ra</w:t>
+      </w:r>
+      <w:r>
+        <w:rPr/>
+        <w:t xml:space="preserve">, xếp theo thời gian bắt đầu gần nhất trước; chưa được vào phòng hoặc đặt giá trước giờ bắt đầu. Đến giờ, phiên tự chuyển sang </w:t>
+      </w:r>
+      <w:r>
+        <w:rPr>
+          <w:b/>
+        </w:rPr>
+        <w:t xml:space="preserve">Đang đấu giá</w:t>
+      </w:r>
+      <w:r>
+        <w:rPr/>
+        <w:t xml:space="preserve">. Thời lượng tính từ lúc bắt đầu đã chọn, không tính từ lúc tạo phòng.</w:t>
       </w:r>
     </w:p>
     <w:p>
@@ -864,7 +958,7 @@
       </w:pPr>
       <w:r>
         <w:rPr/>
-        <w:t xml:space="preserve">• Khi phiên có người thắng kết thúc, khoản giữ chỗ của người mua được dùng để thanh toán đúng giá thắng và cộng cho người bán trong cùng lần xử lý. Không tính phí trong bản demo. Một phiên không bị thu hoặc trả tiền lần thứ hai khi được kiểm tra lại. Không có người thắng thì không chuyển tiền.</w:t>
+        <w:t xml:space="preserve">• Khi phiên có người thắng kết thúc, khoản giữ chỗ của người mua được dùng để thanh toán đúng giá thắng. Thuế do người bán trả, tính trên toàn bộ giá chốt: đến đúng 1.000.000.000 đồng là 10%; trên 1.000.000.000 đồng là 15%. Theo thứ hạng doanh thu trước khi chốt phiên, thuế suất được giảm trực tiếp: Top 1 giảm 5 điểm %, Top 2 giảm 4, Top 3 giảm 3, Top 4–5 giảm 2, Top 6–10 giảm 1; ngoài Top 10 không giảm. Doanh thu xếp hạng là tổng giá chốt trước thuế của tất cả phiên bán thành công của mỗi người bán, không giới hạn theo tháng. Bằng doanh thu thì phiên bán thành công đầu tiên sớm hơn xếp trước, sau đó theo mã tài khoản. Phiên đang mở, hủy hoặc không có người thắng không tạo doanh thu. Thuế được làm tròn đến hai chữ số thập phân; người bán nhận giá chốt trừ thuế. Ví dụ: giá chốt 100.000.000 đồng, người bán Top 1 trả thuế 5.000.000 đồng và nhận 95.000.000 đồng; giá chốt đúng 1 tỷ đồng, ngoài Top 10 trả thuế 100.000.000 đồng và nhận 900.000.000 đồng. Thứ hạng trước phiên, thuế suất ban đầu, mức giảm, thuế thực thu, thanh toán và biên nhận được lưu trong cùng giao dịch; các phiên chốt đồng thời lấy thứ hạng lần lượt theo thứ tự xử lý. Một phiên không bị thu hoặc trả tiền lần thứ hai khi được kiểm tra lại; phiên đã thanh toán trước khi đổi biểu thuế giữ nguyên số tiền lịch sử. Không có người thắng thì không chuyển tiền hoặc thu thuế.</w:t>
       </w:r>
     </w:p>
     <w:p>
@@ -900,7 +994,7 @@
       </w:pPr>
       <w:r>
         <w:rPr/>
-        <w:t xml:space="preserve">Điều 13. Điều kiện đấu giá lại, ngừng và khôi phục mặt hàng</w:t>
+        <w:t xml:space="preserve">Điều 13. Điều kiện đấu giá lại và xóa sản phẩm</w:t>
       </w:r>
     </w:p>
     <w:p>
@@ -936,52 +1030,52 @@
       </w:pPr>
       <w:r>
         <w:rPr/>
-        <w:t xml:space="preserve">• Khi không còn phiên mở, người bán được ngừng đưa mặt hàng của mình ra đấu giá. Mặt hàng đã bị ngừng không được dùng để mở phiên mới khi chưa được khôi phục.</w:t>
-      </w:r>
-    </w:p>
-    <w:p>
-      <w:pPr>
-        <w:pStyle w:val="Normal"/>
-      </w:pPr>
-      <w:r>
-        <w:rPr/>
-        <w:t xml:space="preserve">• Người bán đã đăng nhập được khôi phục mặt hàng của chính mình nếu mặt hàng không có phiên nào đang mở và chưa có phiên kết thúc với người thắng. Phiên trước bị hủy hợp lệ hoặc kết thúc không có người thắng không làm mất quyền khôi phục nếu các điều kiện này vẫn được đáp ứng.</w:t>
-      </w:r>
-    </w:p>
-    <w:p>
-      <w:pPr>
-        <w:pStyle w:val="Normal"/>
-      </w:pPr>
-      <w:r>
-        <w:rPr/>
-        <w:t xml:space="preserve">• Mặt hàng đã có phiên kết thúc với người thắng không được khôi phục để đấu giá lại, kể cả khi chưa thanh toán hoặc giao nhận.</w:t>
-      </w:r>
-    </w:p>
-    <w:p>
-      <w:pPr>
-        <w:pStyle w:val="Normal"/>
-      </w:pPr>
-      <w:r>
-        <w:rPr/>
-        <w:t xml:space="preserve">• Khôi phục chỉ cho phép mặt hàng được tiếp tục sử dụng để mở phiên mới khi đáp ứng các điều kiện khác; không tự mở phiên mới và không mở lại phiên đã kết thúc hoặc bị hủy.</w:t>
-      </w:r>
-    </w:p>
-    <w:p>
-      <w:pPr>
-        <w:pStyle w:val="Normal"/>
-      </w:pPr>
-      <w:r>
-        <w:rPr/>
-        <w:t xml:space="preserve">• Khôi phục không xóa hay thay đổi lượt trả giá, người thắng, kết quả hoặc lịch sử; không đặt lại thời gian, phần thời gian gia hạn còn lại hay lệnh cấm tham gia của các phiên cũ. Nội dung, ảnh, video, ảnh đại diện và thứ tự tư liệu của mặt hàng đã từng có phiên vẫn được giữ nguyên, không được sửa sau khi khôi phục.</w:t>
-      </w:r>
-    </w:p>
-    <w:p>
-      <w:pPr>
-        <w:pStyle w:val="Normal"/>
-      </w:pPr>
-      <w:r>
-        <w:rPr/>
-        <w:t xml:space="preserve">• Nếu mặt hàng đã hoạt động, yêu cầu khôi phục lặp lại của chủ sở hữu không làm thay đổi mặt hàng hoặc các phiên của nó. Người không phải chủ sở hữu không được thực hiện yêu cầu này.</w:t>
+        <w:t xml:space="preserve">• Người bán đã đăng nhập được xóa sản phẩm của chính mình sau khi xác nhận, bao gồm sản phẩm đang sử dụng hoặc đã ngừng từ các phiên trước. Sản phẩm còn phiên đang mở hoặc đã hẹn giờ chưa được xóa; cần kết thúc hoặc hủy phiên theo đúng điều kiện trước.</w:t>
+      </w:r>
+    </w:p>
+    <w:p>
+      <w:pPr>
+        <w:pStyle w:val="Normal"/>
+      </w:pPr>
+      <w:r>
+        <w:rPr/>
+        <w:t xml:space="preserve">• Sản phẩm chưa từng có phiên được xóa khỏi cơ sở dữ liệu cùng toàn bộ ảnh/video trong cùng giao dịch; nếu có lỗi thì hoàn tác toàn bộ. Sản phẩm đã có phiên được xóa khỏi danh sách sản phẩm và không thể khôi phục, sửa hay dùng để mở phiên mới; dữ liệu gốc và ảnh/video phục vụ lịch sử vẫn được lưu.</w:t>
+      </w:r>
+    </w:p>
+    <w:p>
+      <w:pPr>
+        <w:pStyle w:val="Normal"/>
+      </w:pPr>
+      <w:r>
+        <w:rPr/>
+        <w:t xml:space="preserve">• Xóa sản phẩm không xóa hay thay đổi lượt trả giá, người thắng, kết quả, biên nhận, thanh toán hoặc doanh thu đã phát sinh. Xóa không mở lại phiên cũ, không thay đổi các điều kiện đấu giá và không làm giảm tổng doanh thu của người bán. Thao tác xóa và tạo phiên được kiểm tra trong cùng cơ chế khóa sản phẩm để không tạo phiên mới đồng thời với việc xóa.</w:t>
+      </w:r>
+    </w:p>
+    <w:p>
+      <w:pPr>
+        <w:pStyle w:val="Normal"/>
+      </w:pPr>
+      <w:r>
+        <w:rPr/>
+        <w:t xml:space="preserve">• Giao diện Sản phẩm bán nằm trong cửa sổ chính, chỉ hiển thị sản phẩm do tài khoản đăng bán. Các thao tác Sửa, Ảnh / video và Xóa sản phẩm nằm trong dấu ba chấm của từng sản phẩm; thanh dưới chỉ còn Thêm sản phẩm và Làm mới. Bỏ toàn bộ phần khôi phục và nút Đóng phía dưới. Dấu × phía trên bên phải đưa về Sàn đấu giá.</w:t>
+      </w:r>
+    </w:p>
+    <w:p>
+      <w:pPr>
+        <w:pStyle w:val="Normal"/>
+      </w:pPr>
+      <w:r>
+        <w:rPr/>
+        <w:t xml:space="preserve">• Trạng thái sản phẩm dựa vào giao dịch, không dựa vào cờ kích hoạt: Đã bán (đỏ) nếu đã có phiên kết thúc với người thắng; Đang đấu giá (xanh) nếu còn phiên mở, gồm cả phòng hẹn giờ; Chưa giao dịch (đen) nếu không thuộc hai trường hợp trên. Phiên hủy hoặc kết thúc không có người thắng đưa sản phẩm về Chưa giao dịch và có thể mở phiên mới nếu còn đủ điều kiện. Danh sách chọn sản phẩm khi tạo phòng chỉ hiển thị sản phẩm còn được phép sử dụng, chưa giao dịch và chưa có phiên đang mở; sản phẩm Đã bán không thể chọn hoặc tạo phiên lại.</w:t>
+      </w:r>
+    </w:p>
+    <w:p>
+      <w:pPr>
+        <w:pStyle w:val="Normal"/>
+      </w:pPr>
+      <w:r>
+        <w:rPr/>
+        <w:t xml:space="preserve">• Sản phẩm đã mua không hiển thị trong mục Sản phẩm bán và không còn bộ lọc Đã sở hữu. Lịch sử giao dịch, kết quả đấu giá và quyền sở hữu của người thắng vẫn được giữ nguyên. Người bán vẫn thấy trạng thái Đã bán; sản phẩm đã bán không được đưa lên đấu giá lại.</w:t>
       </w:r>
     </w:p>
     <w:p>
@@ -1026,7 +1120,7 @@
       </w:pPr>
       <w:r>
         <w:rPr/>
-        <w:t xml:space="preserve">• Chưa có quy định giao nhận, rút tiền, hoàn tiền sau khi đã thanh toán, thu phí hoặc phạt người thắng bỏ cuộc. Không được trình bày các biện pháp này như những chức năng đã có.</w:t>
+        <w:t xml:space="preserve">• Chưa có quy định giao nhận, hoàn tiền sau khi đã thanh toán hoặc phạt người thắng bỏ cuộc. Không được trình bày các biện pháp này như những chức năng đã có.</w:t>
       </w:r>
     </w:p>
     <w:p>

</xml_diff>